<commit_message>
Corrected spelling error in Opgaver
</commit_message>
<xml_diff>
--- a/public/hearing-loss/tasks/Opgaver.docx
+++ b/public/hearing-loss/tasks/Opgaver.docx
@@ -30,6 +30,9 @@
         <w:spacing w:line="360" w:lineRule="auto"/>
       </w:pPr>
       <w:r>
+        <w:rPr>
+          <w:noProof/>
+        </w:rPr>
         <w:drawing>
           <wp:inline distT="0" distB="0" distL="0" distR="0" wp14:anchorId="311A55F0" wp14:editId="4828450C">
             <wp:extent cx="5581403" cy="5581403"/>
@@ -206,21 +209,21 @@
         <w:t>1</w:t>
       </w:r>
       <w:r>
-        <w:t>.</w:t>
-      </w:r>
-      <w:r>
-        <w:t>3</w:t>
-      </w:r>
-      <w:r>
-        <w:t>)</w:t>
-      </w:r>
-    </w:p>
-    <w:p>
-      <w:pPr>
-        <w:spacing w:line="360" w:lineRule="auto"/>
-      </w:pPr>
-      <w:r>
-        <w:t>Ved hvilke frekvenser er hørelsen bedst?</w:t>
+        <w:t>.3)</w:t>
+      </w:r>
+    </w:p>
+    <w:p>
+      <w:pPr>
+        <w:spacing w:line="360" w:lineRule="auto"/>
+      </w:pPr>
+      <w:r>
+        <w:t xml:space="preserve">Ved hvilke frekvenser er hørelsen </w:t>
+      </w:r>
+      <w:r>
+        <w:t>værst</w:t>
+      </w:r>
+      <w:r>
+        <w:t>?</w:t>
       </w:r>
     </w:p>
     <w:p>
@@ -320,6 +323,9 @@
         <w:spacing w:line="360" w:lineRule="auto"/>
       </w:pPr>
       <w:r>
+        <w:rPr>
+          <w:noProof/>
+        </w:rPr>
         <w:drawing>
           <wp:inline distT="0" distB="0" distL="0" distR="0" wp14:anchorId="3E83F8E2" wp14:editId="67EFC06E">
             <wp:extent cx="5581403" cy="5581403"/>
@@ -396,13 +402,7 @@
       </w:pPr>
       <w:r>
         <w:lastRenderedPageBreak/>
-        <w:t xml:space="preserve">Opgave </w:t>
-      </w:r>
-      <w:r>
-        <w:t>2</w:t>
-      </w:r>
-      <w:r>
-        <w:t>.1)</w:t>
+        <w:t>Opgave 2.1)</w:t>
       </w:r>
     </w:p>
     <w:p>
@@ -413,13 +413,7 @@
         <w:spacing w:line="360" w:lineRule="auto"/>
       </w:pPr>
       <w:r>
-        <w:t>Hvilket slags høretab er dette?</w:t>
-      </w:r>
-      <w:r>
-        <w:t xml:space="preserve"> </w:t>
-      </w:r>
-      <w:r>
-        <w:t>(Se sidste side)</w:t>
+        <w:t>Hvilket slags høretab er dette? (Se sidste side)</w:t>
       </w:r>
     </w:p>
     <w:p>
@@ -449,13 +443,7 @@
         <w:spacing w:line="360" w:lineRule="auto"/>
       </w:pPr>
       <w:r>
-        <w:t xml:space="preserve">Opgave </w:t>
-      </w:r>
-      <w:r>
-        <w:t>2</w:t>
-      </w:r>
-      <w:r>
-        <w:t>.2)</w:t>
+        <w:t>Opgave 2.2)</w:t>
       </w:r>
     </w:p>
     <w:p>
@@ -493,21 +481,21 @@
         <w:spacing w:line="360" w:lineRule="auto"/>
       </w:pPr>
       <w:r>
-        <w:t xml:space="preserve">Opgave </w:t>
-      </w:r>
-      <w:r>
-        <w:t>2</w:t>
-      </w:r>
-      <w:r>
-        <w:t>.3)</w:t>
-      </w:r>
-    </w:p>
-    <w:p>
-      <w:pPr>
-        <w:spacing w:line="360" w:lineRule="auto"/>
-      </w:pPr>
-      <w:r>
-        <w:t>Ved hvilke frekvenser er hørelsen bedst?</w:t>
+        <w:t>Opgave 2.3)</w:t>
+      </w:r>
+    </w:p>
+    <w:p>
+      <w:pPr>
+        <w:spacing w:line="360" w:lineRule="auto"/>
+      </w:pPr>
+      <w:r>
+        <w:t xml:space="preserve">Ved hvilke frekvenser er hørelsen </w:t>
+      </w:r>
+      <w:r>
+        <w:t>værst</w:t>
+      </w:r>
+      <w:r>
+        <w:t>?</w:t>
       </w:r>
     </w:p>
     <w:p>
@@ -537,13 +525,7 @@
         <w:spacing w:line="360" w:lineRule="auto"/>
       </w:pPr>
       <w:r>
-        <w:t xml:space="preserve">Opgave </w:t>
-      </w:r>
-      <w:r>
-        <w:t>2</w:t>
-      </w:r>
-      <w:r>
-        <w:t>.3)</w:t>
+        <w:t>Opgave 2.3)</w:t>
       </w:r>
     </w:p>
     <w:p>
@@ -612,6 +594,9 @@
         <w:spacing w:line="360" w:lineRule="auto"/>
       </w:pPr>
       <w:r>
+        <w:rPr>
+          <w:noProof/>
+        </w:rPr>
         <w:drawing>
           <wp:inline distT="0" distB="0" distL="0" distR="0" wp14:anchorId="0930BECE" wp14:editId="2E1494F1">
             <wp:extent cx="5581403" cy="5581403"/>
@@ -688,13 +673,7 @@
       </w:pPr>
       <w:r>
         <w:lastRenderedPageBreak/>
-        <w:t>Opgave</w:t>
-      </w:r>
-      <w:r>
-        <w:t xml:space="preserve"> 3</w:t>
-      </w:r>
-      <w:r>
-        <w:t>.1)</w:t>
+        <w:t>Opgave 3.1)</w:t>
       </w:r>
     </w:p>
     <w:p>
@@ -705,13 +684,7 @@
         <w:spacing w:line="360" w:lineRule="auto"/>
       </w:pPr>
       <w:r>
-        <w:t>Hvilket slags høretab er dette?</w:t>
-      </w:r>
-      <w:r>
-        <w:t xml:space="preserve"> </w:t>
-      </w:r>
-      <w:r>
-        <w:t>(Se sidste side)</w:t>
+        <w:t>Hvilket slags høretab er dette? (Se sidste side)</w:t>
       </w:r>
     </w:p>
     <w:p>
@@ -741,13 +714,7 @@
         <w:spacing w:line="360" w:lineRule="auto"/>
       </w:pPr>
       <w:r>
-        <w:t xml:space="preserve">Opgave </w:t>
-      </w:r>
-      <w:r>
-        <w:t>3</w:t>
-      </w:r>
-      <w:r>
-        <w:t>.2)</w:t>
+        <w:t>Opgave 3.2)</w:t>
       </w:r>
     </w:p>
     <w:p>
@@ -785,21 +752,24 @@
         <w:spacing w:line="360" w:lineRule="auto"/>
       </w:pPr>
       <w:r>
-        <w:t xml:space="preserve">Opgave </w:t>
-      </w:r>
-      <w:r>
-        <w:t>3</w:t>
-      </w:r>
-      <w:r>
-        <w:t>.3)</w:t>
-      </w:r>
-    </w:p>
-    <w:p>
-      <w:pPr>
-        <w:spacing w:line="360" w:lineRule="auto"/>
-      </w:pPr>
-      <w:r>
-        <w:t>Ved hvilke frekvenser er hørelsen bedst?</w:t>
+        <w:t>Opgave 3.3)</w:t>
+      </w:r>
+    </w:p>
+    <w:p>
+      <w:pPr>
+        <w:spacing w:line="360" w:lineRule="auto"/>
+      </w:pPr>
+      <w:r>
+        <w:t xml:space="preserve">Ved hvilke frekvenser er hørelsen </w:t>
+      </w:r>
+      <w:r>
+        <w:t>værst</w:t>
+      </w:r>
+      <w:r>
+        <w:tab/>
+      </w:r>
+      <w:r>
+        <w:t>?</w:t>
       </w:r>
     </w:p>
     <w:p>
@@ -829,13 +799,7 @@
         <w:spacing w:line="360" w:lineRule="auto"/>
       </w:pPr>
       <w:r>
-        <w:t xml:space="preserve">Opgave </w:t>
-      </w:r>
-      <w:r>
-        <w:t>3</w:t>
-      </w:r>
-      <w:r>
-        <w:t>.3)</w:t>
+        <w:t>Opgave 3.3)</w:t>
       </w:r>
     </w:p>
     <w:p>
@@ -913,6 +877,9 @@
               <w:t>Normal hørelse)</w:t>
             </w:r>
             <w:r>
+              <w:rPr>
+                <w:noProof/>
+              </w:rPr>
               <w:drawing>
                 <wp:inline distT="0" distB="0" distL="0" distR="0" wp14:anchorId="0E1A9ABC" wp14:editId="270DC06E">
                   <wp:extent cx="2798876" cy="1980000"/>
@@ -964,6 +931,9 @@
               <w:t>Højfrekvent tab)</w:t>
             </w:r>
             <w:r>
+              <w:rPr>
+                <w:noProof/>
+              </w:rPr>
               <w:drawing>
                 <wp:inline distT="0" distB="0" distL="0" distR="0" wp14:anchorId="4566551F" wp14:editId="5F595284">
                   <wp:extent cx="2832249" cy="1980000"/>
@@ -1017,6 +987,9 @@
               <w:t>Lavfrekvent tab)</w:t>
             </w:r>
             <w:r>
+              <w:rPr>
+                <w:noProof/>
+              </w:rPr>
               <w:drawing>
                 <wp:inline distT="0" distB="0" distL="0" distR="0" wp14:anchorId="41E6948B" wp14:editId="4B3AF50C">
                   <wp:extent cx="2846684" cy="1980000"/>
@@ -1074,6 +1047,9 @@
               <w:t xml:space="preserve"> skade)</w:t>
             </w:r>
             <w:r>
+              <w:rPr>
+                <w:noProof/>
+              </w:rPr>
               <w:drawing>
                 <wp:inline distT="0" distB="0" distL="0" distR="0" wp14:anchorId="08E945FE" wp14:editId="7E6FD595">
                   <wp:extent cx="2836449" cy="1980000"/>
@@ -1133,6 +1109,9 @@
               <w:t xml:space="preserve"> høretab)</w:t>
             </w:r>
             <w:r>
+              <w:rPr>
+                <w:noProof/>
+              </w:rPr>
               <w:drawing>
                 <wp:inline distT="0" distB="0" distL="0" distR="0" wp14:anchorId="71CBAB43" wp14:editId="397814B9">
                   <wp:extent cx="2840316" cy="1980000"/>
@@ -1190,6 +1169,9 @@
               <w:t xml:space="preserve"> høretab)</w:t>
             </w:r>
             <w:r>
+              <w:rPr>
+                <w:noProof/>
+              </w:rPr>
               <w:drawing>
                 <wp:inline distT="0" distB="0" distL="0" distR="0" wp14:anchorId="1872664C" wp14:editId="2ED52E1D">
                   <wp:extent cx="2834548" cy="1980000"/>
@@ -2124,6 +2106,7 @@
   <w:style w:type="character" w:default="1" w:styleId="DefaultParagraphFont">
     <w:name w:val="Default Paragraph Font"/>
     <w:uiPriority w:val="1"/>
+    <w:semiHidden/>
     <w:unhideWhenUsed/>
   </w:style>
   <w:style w:type="table" w:default="1" w:styleId="TableNormal">

</xml_diff>